<commit_message>
Refina informe: perfil universitario sin experiencia en industria y nivel Student
Co-Authored-By: Claude Opus 5.5 <noreply@anthropic.com>
Claude-Session: https://claude.ai/code/session_01XoDZLsg3S6BNvJBdoo6Rq7
</commit_message>
<xml_diff>
--- a/informes/Informe_entrevista_Gabriel_Vasconez.docx
+++ b/informes/Informe_entrevista_Gabriel_Vasconez.docx
@@ -1252,6 +1252,16 @@
                 <w:bCs/>
               </w:rPr>
             </w:pPr>
+            <w:r>
+              <w:rPr>
+                <w:rFonts w:ascii="Roboto Slab" w:eastAsia="Roboto Slab" w:hAnsi="Roboto Slab" w:cs="Roboto Slab"/>
+                <w:b/>
+                <w:bCs/>
+                <w:sz w:val="36"/>
+                <w:szCs w:val="36"/>
+              </w:rPr>
+              <w:t xml:space="preserve">X</w:t>
+            </w:r>
           </w:p>
         </w:tc>
         <w:tc>
@@ -1282,16 +1292,6 @@
                 <w:bCs/>
               </w:rPr>
             </w:pPr>
-            <w:r>
-              <w:rPr>
-                <w:rFonts w:ascii="Roboto Slab" w:eastAsia="Roboto Slab" w:hAnsi="Roboto Slab" w:cs="Roboto Slab"/>
-                <w:b/>
-                <w:bCs/>
-                <w:sz w:val="36"/>
-                <w:szCs w:val="36"/>
-              </w:rPr>
-              <w:t xml:space="preserve">X</w:t>
-            </w:r>
           </w:p>
         </w:tc>
         <w:tc>
@@ -1544,7 +1544,39 @@
           <w:sz w:val="20"/>
           <w:szCs w:val="20"/>
         </w:rPr>
-        <w:t xml:space="preserve">Obtuvo un resultado sobresaliente en la prueba teórica (19/20, 95 %), pero un desempeño muy por debajo de lo esperado en la prueba práctica (18/100, 18 %). La nota final es de 33 % y la clasificación es NO APROBADO. La distancia entre ambas pruebas indica que el candidato domina los conceptos, pero todavía no los convierte en un diseño aplicable, una implementación funcional ni una defensa técnica argumentada.</w:t>
+        <w:t xml:space="preserve">Obtuvo un resultado sobresaliente en la prueba teórica (19/20, 95 %), pero un desempeño muy por debajo de lo esperado en la prueba práctica (18/100, 18 %). La nota final es de 33 % y la clasificación es NO APROBADO. La distancia entre ambas pruebas indica que el candidato conoce los términos y conceptos de inteligencia artificial, pero todavía no sabe llevarlos a la práctica: no los convierte en un diseño aplicable, una implementación funcional ni una defensa técnica argumentada.</w:t>
+      </w:r>
+    </w:p>
+    <w:p>
+      <w:pPr>
+        <w:keepNext/>
+        <w:spacing w:before="200" w:after="80" w:line="264" w:lineRule="auto"/>
+        <w:jc w:val="left"/>
+      </w:pPr>
+      <w:r>
+        <w:rPr>
+          <w:rFonts w:ascii="Roboto Slab" w:eastAsia="Roboto Slab" w:hAnsi="Roboto Slab" w:cs="Roboto Slab"/>
+          <w:b/>
+          <w:bCs/>
+          <w:color w:val="1F3864"/>
+          <w:sz w:val="22"/>
+          <w:szCs w:val="22"/>
+        </w:rPr>
+        <w:t xml:space="preserve">Perfil del candidato</w:t>
+      </w:r>
+    </w:p>
+    <w:p>
+      <w:pPr>
+        <w:spacing w:before="0" w:after="120" w:line="264" w:lineRule="auto"/>
+        <w:jc w:val="both"/>
+      </w:pPr>
+      <w:r>
+        <w:rPr>
+          <w:rFonts w:ascii="Roboto Slab" w:eastAsia="Roboto Slab" w:hAnsi="Roboto Slab" w:cs="Roboto Slab"/>
+          <w:sz w:val="20"/>
+          <w:szCs w:val="20"/>
+        </w:rPr>
+        <w:t xml:space="preserve">El candidato todavía cursa la universidad. Declara al menos un año de experiencia, pero no ha participado en proyectos de software reales a nivel de industria. Esto explica buena parte de los resultados: maneja el vocabulario de IA (LLM, RAG, agentes, MCP, guardrails, prompt injection) y de arquitectura limpia, pero no ha tenido que aplicarlo en un sistema productivo con usuarios, restricciones de seguridad, despliegue y trabajo en equipo. Su perfil corresponde hoy a un estudiante con formación teórica sólida y poca práctica aplicada.</w:t>
       </w:r>
     </w:p>
     <w:p>
@@ -3562,7 +3594,7 @@
           <w:sz w:val="20"/>
           <w:szCs w:val="20"/>
         </w:rPr>
-        <w:t xml:space="preserve">Muy buen dominio conceptual de los temas evaluados. Es el punto más fuerte del candidato y la base sobre la cual podría construir las competencias prácticas que le faltan.</w:t>
+        <w:t xml:space="preserve">Muy buen dominio conceptual de los temas evaluados. Conoce la terminología de inteligencia artificial y responde correctamente a preguntas de definición. Es el punto más fuerte del candidato, pero en la prueba práctica se comprobó que ese conocimiento es sobre todo teórico y todavía no lo sabe implementar.</w:t>
       </w:r>
     </w:p>
     <w:p>
@@ -3912,7 +3944,7 @@
           <w:sz w:val="20"/>
           <w:szCs w:val="20"/>
         </w:rPr>
-        <w:t xml:space="preserve">No se recomienda continuar con el proceso para la posición de AI Engineer. El candidato tiene una buena base teórica, pero en este momento no cumple con lo mínimo en diseño aplicado, implementación, despliegue y seguridad de soluciones con agentes LLM.</w:t>
+        <w:t xml:space="preserve">No se recomienda continuar con el proceso para la posición de AI Engineer. El candidato tiene una buena base teórica, pero sigue en la universidad, no ha trabajado en proyectos reales de la industria y en este momento no cumple con lo mínimo en diseño aplicado, implementación, despliegue y seguridad de soluciones con agentes LLM.</w:t>
       </w:r>
     </w:p>
     <w:p>
@@ -3926,7 +3958,7 @@
           <w:sz w:val="20"/>
           <w:szCs w:val="20"/>
         </w:rPr>
-        <w:t xml:space="preserve">Por su nivel conceptual podría considerarse para un rol Junior con acompañamiento técnico, o volver a evaluarse en un proceso futuro, una vez que refuerce la implementación de arquitecturas hexagonales, los controles de seguridad para agentes (RBAC, allowlist de herramientas, defensa contra prompt injection, auditoría) y el despliegue en cloud.</w:t>
+        <w:t xml:space="preserve">Por su nivel conceptual podría considerarse para un programa de prácticas o trainee, con mentoría técnica y participación en un proyecto real. También podría volver a evaluarse en un proceso futuro, cuando tenga experiencia en proyectos de industria y haya reforzado la implementación de arquitecturas hexagonales, los controles de seguridad para agentes (RBAC, allowlist de herramientas, defensa contra prompt injection, auditoría) y el despliegue en cloud.</w:t>
       </w:r>
     </w:p>
     <w:p>
@@ -4054,7 +4086,7 @@
                 <w:sz w:val="22"/>
                 <w:szCs w:val="22"/>
               </w:rPr>
-              <w:t xml:space="preserve">No aterriza los conceptos de arquitectura limpia y hexagonal en un diseño aplicable al escenario. No documenta ni justifica decisiones de diseño, alternativas ni trade-offs.</w:t>
+              <w:t xml:space="preserve">Sin experiencia en proyectos de industria, por lo que no ha trabajado con procesos reales de desarrollo (metodologías ágiles, revisión de código, gestión de requerimientos). No aterriza los conceptos de arquitectura limpia y hexagonal en un diseño aplicable al escenario ni justifica decisiones de diseño, alternativas o trade-offs.</w:t>
             </w:r>
           </w:p>
         </w:tc>
@@ -4092,7 +4124,7 @@
                 <w:sz w:val="22"/>
                 <w:szCs w:val="22"/>
               </w:rPr>
-              <w:t xml:space="preserve">Confunde las capas externas con la capa de dominio y acopla autenticación y controles dentro del dominio. El flujo de extremo a extremo quedó parcial, sin capa de presentación y con una integración MCP y LLM simulada que no se demostró operativa.</w:t>
+              <w:t xml:space="preserve">Conoce los términos de IA pero no sabe implementarlos en una solución real. Confunde las capas externas con la capa de dominio y acopla autenticación y controles dentro del dominio. El flujo de extremo a extremo quedó parcial, sin capa de presentación y con una integración MCP y LLM simulada que no se demostró operativa.</w:t>
             </w:r>
           </w:p>
         </w:tc>

</xml_diff>